<commit_message>
Dejar solo mes y año en la fecha de mi portada
Co-Authored-By: Claude Opus 5.5 <noreply@anthropic.com>
Claude-Session: https://claude.ai/code/session_01MPxHATC7J23odgNHR4pRGu
</commit_message>
<xml_diff>
--- a/Portada_Mia_Delimitada.docx
+++ b/Portada_Mia_Delimitada.docx
@@ -1380,7 +1380,7 @@
           <w:szCs w:val="24"/>
           <w:lang w:val="es-ES"/>
         </w:rPr>
-        <w:t>Jueves, 01</w:t>
+        <w:t>Octubre</w:t>
       </w:r>
       <w:r>
         <w:rPr>
@@ -1388,7 +1388,7 @@
           <w:szCs w:val="24"/>
           <w:lang w:val="es-ES"/>
         </w:rPr>
-        <w:t xml:space="preserve"> de </w:t>
+        <w:t xml:space="preserve"/>
       </w:r>
       <w:r>
         <w:rPr>
@@ -1396,7 +1396,7 @@
           <w:szCs w:val="24"/>
           <w:lang w:val="es-ES"/>
         </w:rPr>
-        <w:t>octubre</w:t>
+        <w:t/>
       </w:r>
       <w:r>
         <w:rPr>

</xml_diff>